<commit_message>
feat: sync W34 schedule, strength plan B, and weekly articles to live dashboard
</commit_message>
<xml_diff>
--- a/docs/weekly/2026-W33_當週鐵人新知與文章整理.docx
+++ b/docs/weekly/2026-W33_當週鐵人新知與文章整理.docx
@@ -27,7 +27,7 @@
           <w:color w:val="555555"/>
           <w:sz w:val="19"/>
         </w:rPr>
-        <w:t>彙整時間：2026-08-10 12:44:56　｜　時間範圍：過去 7 天</w:t>
+        <w:t>彙整時間：2026-08-16 17:12:57　｜　時間範圍：過去 7 天</w:t>
         <w:br/>
         <w:t>來源網站：Slowtwitch, Triathlete, 220 Triathlon, TrainingPeaks, Joe Friel</w:t>
       </w:r>
@@ -59,7 +59,7 @@
           <w:color w:val="595959"/>
           <w:sz w:val="19"/>
         </w:rPr>
-        <w:t xml:space="preserve">【220 Triathlon | 2026-08-07】 </w:t>
+        <w:t xml:space="preserve">【220 Triathlon | 2026-08-16】 </w:t>
       </w:r>
       <w:hyperlink w:rId="rId11">
         <w:r>
@@ -70,7 +70,7 @@
             <w:rFonts w:ascii="Calibri" w:hAnsi="Calibri" w:eastAsia="Microsoft JhengHei"/>
             <w:sz w:val="22"/>
           </w:rPr>
-          <w:t>I swapped strength training for triathlon training – did I lose my strength?</w:t>
+          <w:t>“I love the atmosphere here!”Jonas Schomburg (DEU) takes first Ironman win in Kalmar</w:t>
         </w:r>
       </w:hyperlink>
     </w:p>
@@ -86,7 +86,7 @@
           <w:color w:val="444444"/>
           <w:sz w:val="19"/>
         </w:rPr>
-        <w:t>After months of chasing strength personal bests, 220 Triathlon writer India Paine swapped heavy lifting for swimming, cycling and running to train for her first T100. But after three months of reduced...</w:t>
+        <w:t>In an action-packed final qualifying race for the Ironman World Champs in Kona, Jonas Shomburg took the lead during the run and won his first Ironman race in an impressive time of 7:22:57 while in the...</w:t>
       </w:r>
     </w:p>
     <w:p>
@@ -101,7 +101,7 @@
           <w:color w:val="595959"/>
           <w:sz w:val="19"/>
         </w:rPr>
-        <w:t xml:space="preserve">【Slowtwitch | 2026-08-07】 </w:t>
+        <w:t xml:space="preserve">【220 Triathlon | 2026-08-15】 </w:t>
       </w:r>
       <w:hyperlink w:rId="rId12">
         <w:r>
@@ -112,7 +112,7 @@
             <w:rFonts w:ascii="Calibri" w:hAnsi="Calibri" w:eastAsia="Microsoft JhengHei"/>
             <w:sz w:val="22"/>
           </w:rPr>
-          <w:t>H2O Audio TRI 2 PRO and TRI Run: Sound for the Long Haul</w:t>
+          <w:t>Ironman Leeds cancel swim over concerns about water quality in the lake</w:t>
         </w:r>
       </w:hyperlink>
     </w:p>
@@ -128,9 +128,7 @@
           <w:color w:val="444444"/>
           <w:sz w:val="19"/>
         </w:rPr>
-        <w:t>H2O Audio TRI 2 PRO vs TRI Run: two open-ear bone conduction headphones tested across swim, bike and run. Which one belongs in your training week?</w:t>
-        <w:br/>
-        <w:t>The post H2O Audio TRI 2 PRO and TRI Run: Sound for t...</w:t>
+        <w:t>Ironman have announced today that there will be no swim at tomorrows race in Leeds and that todays practise swim will also be cancelled. The news comes amid concerns over water quality at Waterloo Lak...</w:t>
       </w:r>
     </w:p>
     <w:p>
@@ -145,7 +143,7 @@
           <w:color w:val="595959"/>
           <w:sz w:val="19"/>
         </w:rPr>
-        <w:t xml:space="preserve">【220 Triathlon | 2026-08-06】 </w:t>
+        <w:t xml:space="preserve">【Triathlete Magazine | 2026-08-13】 </w:t>
       </w:r>
       <w:hyperlink w:rId="rId13">
         <w:r>
@@ -156,7 +154,7 @@
             <w:rFonts w:ascii="Calibri" w:hAnsi="Calibri" w:eastAsia="Microsoft JhengHei"/>
             <w:sz w:val="22"/>
           </w:rPr>
-          <w:t>What are the best swim changing robes? I’m a swim coach, these are the 10 robes I’d wear to keep warm and dry</w:t>
+          <w:t>Tired of the Same Workout Routines? These Quick Swim, Bike, Run Drills Produce Actual Speed</w:t>
         </w:r>
       </w:hyperlink>
     </w:p>
@@ -172,7 +170,9 @@
           <w:color w:val="444444"/>
           <w:sz w:val="19"/>
         </w:rPr>
-        <w:t>Swimming outdoors and need an excellent changing robe to keep you warm and dry? Outdoors swim coach Helen Webster tests some of the best on the market...</w:t>
+        <w:t>Shake up your midseason training with these expert-approved drills that challenge your body and refresh your mind.</w:t>
+        <w:br/>
+        <w:t>Read the full article at Tired of the Same Workout Routines? These Quick Swim, Bike, ...</w:t>
       </w:r>
     </w:p>
     <w:p>
@@ -187,7 +187,7 @@
           <w:color w:val="595959"/>
           <w:sz w:val="19"/>
         </w:rPr>
-        <w:t xml:space="preserve">【Triathlete Magazine | 2026-08-06】 </w:t>
+        <w:t xml:space="preserve">【220 Triathlon | 2026-08-13】 </w:t>
       </w:r>
       <w:hyperlink w:rId="rId14">
         <w:r>
@@ -198,7 +198,7 @@
             <w:rFonts w:ascii="Calibri" w:hAnsi="Calibri" w:eastAsia="Microsoft JhengHei"/>
             <w:sz w:val="22"/>
           </w:rPr>
-          <w:t>My Race Was Canceled. Can I Do It On My Own Anyway?</w:t>
+          <w:t>How do you pick the right triathlon wetsuit? We compare the Orca Athlex Flex V2 and Blueseventy Fusion to find out</w:t>
         </w:r>
       </w:hyperlink>
     </w:p>
@@ -214,9 +214,7 @@
           <w:color w:val="444444"/>
           <w:sz w:val="19"/>
         </w:rPr>
-        <w:t>When your target race gets canceled, you don't have to pack away your fitness. Here’s how to pivot, adapt, or create your own challenge.</w:t>
-        <w:br/>
-        <w:t>Read the full article at My Race Was Canceled. Can I Do It On M...</w:t>
+        <w:t>We put two mid-range wetsuits head-to-head to see which you should invest in for your tri training and racing.</w:t>
       </w:r>
     </w:p>
     <w:p>
@@ -231,7 +229,7 @@
           <w:color w:val="595959"/>
           <w:sz w:val="19"/>
         </w:rPr>
-        <w:t xml:space="preserve">【220 Triathlon | 2026-08-06】 </w:t>
+        <w:t xml:space="preserve">【220 Triathlon | 2026-08-13】 </w:t>
       </w:r>
       <w:hyperlink w:rId="rId15">
         <w:r>
@@ -242,7 +240,7 @@
             <w:rFonts w:ascii="Calibri" w:hAnsi="Calibri" w:eastAsia="Microsoft JhengHei"/>
             <w:sz w:val="22"/>
           </w:rPr>
-          <w:t>I’m an open-water swim coach – I tested 12 women’s swimsuits to find the best</w:t>
+          <w:t>“Music is a big part of how I get through the work.” Lucy Charles-Barclay reveals how waterproof headphones are her secret training weapon</w:t>
         </w:r>
       </w:hyperlink>
     </w:p>
@@ -258,7 +256,7 @@
           <w:color w:val="444444"/>
           <w:sz w:val="19"/>
         </w:rPr>
-        <w:t>I'm an open-water swim coach and 220 Triathlon editor, and I tested and rated 12 of the best women's swimsuits to help you choose the right one for your swimming.</w:t>
+        <w:t>Lucy the mermaid Charles-Barclay is well known for her swimming prowess, but has shared how listening to music really helps her get the training done. The Ironman champ is collaborating with H20 Audio...</w:t>
       </w:r>
     </w:p>
     <w:p>
@@ -273,7 +271,7 @@
           <w:color w:val="595959"/>
           <w:sz w:val="19"/>
         </w:rPr>
-        <w:t xml:space="preserve">【Triathlete Magazine | 2026-08-04】 </w:t>
+        <w:t xml:space="preserve">【220 Triathlon | 2026-08-12】 </w:t>
       </w:r>
       <w:hyperlink w:rId="rId16">
         <w:r>
@@ -284,7 +282,7 @@
             <w:rFonts w:ascii="Calibri" w:hAnsi="Calibri" w:eastAsia="Microsoft JhengHei"/>
             <w:sz w:val="22"/>
           </w:rPr>
-          <w:t>Why This Paralympic Medalist Just Spent 47 Days Doing a Cross-Country Triathlon</w:t>
+          <w:t>What are the best watches for swimming? We test the top options for pool training and open-water swims</w:t>
         </w:r>
       </w:hyperlink>
     </w:p>
@@ -300,93 +298,7 @@
           <w:color w:val="444444"/>
           <w:sz w:val="19"/>
         </w:rPr>
-        <w:t>Paralympic medalist Mohamed Lahna just completed a 3,300-mile journey of swimming, cycling, and running across the United States, but his road to this moment started long before.</w:t>
-        <w:br/>
-        <w:t>Read the full article...</w:t>
-      </w:r>
-    </w:p>
-    <w:p>
-      <w:pPr>
-        <w:keepNext/>
-        <w:spacing w:before="160" w:after="40"/>
-      </w:pPr>
-      <w:r>
-        <w:rPr>
-          <w:rFonts w:ascii="Calibri" w:hAnsi="Calibri" w:eastAsia="Microsoft JhengHei"/>
-          <w:b/>
-          <w:color w:val="595959"/>
-          <w:sz w:val="19"/>
-        </w:rPr>
-        <w:t xml:space="preserve">【220 Triathlon | 2026-08-04】 </w:t>
-      </w:r>
-      <w:hyperlink w:rId="rId17">
-        <w:r>
-          <w:rPr>
-            <w:color w:val="1F4D78"/>
-            <w:u w:val="single"/>
-            <w:b/>
-            <w:rFonts w:ascii="Calibri" w:hAnsi="Calibri" w:eastAsia="Microsoft JhengHei"/>
-            <w:sz w:val="22"/>
-          </w:rPr>
-          <w:t>What are the best running jackets? Our team shares favourite waterproof, windproof, and thermal options</w:t>
-        </w:r>
-      </w:hyperlink>
-    </w:p>
-    <w:p>
-      <w:pPr>
-        <w:spacing w:after="200"/>
-        <w:ind w:left="360"/>
-      </w:pPr>
-      <w:r>
-        <w:rPr>
-          <w:rFonts w:ascii="Calibri" w:hAnsi="Calibri" w:eastAsia="Microsoft JhengHei"/>
-          <w:b w:val="0"/>
-          <w:color w:val="444444"/>
-          <w:sz w:val="19"/>
-        </w:rPr>
-        <w:t>The best running jackets will help you put in the miles no matter the weather. These are the 9 top picks of our expert testing team.</w:t>
-      </w:r>
-    </w:p>
-    <w:p>
-      <w:pPr>
-        <w:keepNext/>
-        <w:spacing w:before="160" w:after="40"/>
-      </w:pPr>
-      <w:r>
-        <w:rPr>
-          <w:rFonts w:ascii="Calibri" w:hAnsi="Calibri" w:eastAsia="Microsoft JhengHei"/>
-          <w:b/>
-          <w:color w:val="595959"/>
-          <w:sz w:val="19"/>
-        </w:rPr>
-        <w:t xml:space="preserve">【220 Triathlon | 2026-08-03】 </w:t>
-      </w:r>
-      <w:hyperlink w:rId="rId18">
-        <w:r>
-          <w:rPr>
-            <w:color w:val="1F4D78"/>
-            <w:u w:val="single"/>
-            <w:b/>
-            <w:rFonts w:ascii="Calibri" w:hAnsi="Calibri" w:eastAsia="Microsoft JhengHei"/>
-            <w:sz w:val="22"/>
-          </w:rPr>
-          <w:t>“Everything has gotten more expensive.” Did Ironman accidentally create the ‘one and done’ triathlete?</w:t>
-        </w:r>
-      </w:hyperlink>
-    </w:p>
-    <w:p>
-      <w:pPr>
-        <w:spacing w:after="200"/>
-        <w:ind w:left="360"/>
-      </w:pPr>
-      <w:r>
-        <w:rPr>
-          <w:rFonts w:ascii="Calibri" w:hAnsi="Calibri" w:eastAsia="Microsoft JhengHei"/>
-          <w:b w:val="0"/>
-          <w:color w:val="444444"/>
-          <w:sz w:val="19"/>
-        </w:rPr>
-        <w:t>The phenomenon of the one and done triathlete is one that has attracted some attention recently on this site. But is it really a thing – and what can be done to keep triathletes in the sport longer-te...</w:t>
+        <w:t>Our expert testers put nine of the best swimming watches through their paces to help you find the right one for your training and budget.</w:t>
       </w:r>
     </w:p>
     <w:p>
@@ -416,9 +328,9 @@
           <w:color w:val="595959"/>
           <w:sz w:val="19"/>
         </w:rPr>
-        <w:t xml:space="preserve">【Slowtwitch | 2026-08-07】 </w:t>
+        <w:t xml:space="preserve">【TrainingPeaks Blog | 2026-08-15】 </w:t>
       </w:r>
-      <w:hyperlink w:rId="rId19">
+      <w:hyperlink w:rId="rId17">
         <w:r>
           <w:rPr>
             <w:color w:val="1F4D78"/>
@@ -427,7 +339,7 @@
             <w:rFonts w:ascii="Calibri" w:hAnsi="Calibri" w:eastAsia="Microsoft JhengHei"/>
             <w:sz w:val="22"/>
           </w:rPr>
-          <w:t>FastTT’s Triathlon Aero Bar is Designed for Speed, Comfort, and Stability</w:t>
+          <w:t>Cycling Nutrition: The Simplest Shift that Improves Performance</w:t>
         </w:r>
       </w:hyperlink>
     </w:p>
@@ -443,9 +355,9 @@
           <w:color w:val="444444"/>
           <w:sz w:val="19"/>
         </w:rPr>
-        <w:t>I’m not a bike fitter, or a wind tunnel expert. I’m just an average triathlete on a journey to find an upgrade to my existing cockpit that makes it a...</w:t>
+        <w:t xml:space="preserve">It’s not a secret supplement. Or carbs per hour on the bike. It might just be what you eat on a Tuesday. Here’s how to tweak your nutrition to improve cycling performance. </w:t>
         <w:br/>
-        <w:t>The post FastTT’s Triathlon Aero Bar is Designe...</w:t>
+        <w:t>The post Cycling Nutrition:...</w:t>
       </w:r>
     </w:p>
     <w:p>
@@ -460,9 +372,9 @@
           <w:color w:val="595959"/>
           <w:sz w:val="19"/>
         </w:rPr>
-        <w:t xml:space="preserve">【TrainingPeaks Blog | 2026-08-07】 </w:t>
+        <w:t xml:space="preserve">【220 Triathlon | 2026-08-15】 </w:t>
       </w:r>
-      <w:hyperlink w:rId="rId20">
+      <w:hyperlink w:rId="rId18">
         <w:r>
           <w:rPr>
             <w:color w:val="1F4D78"/>
@@ -471,7 +383,7 @@
             <w:rFonts w:ascii="Calibri" w:hAnsi="Calibri" w:eastAsia="Microsoft JhengHei"/>
             <w:sz w:val="22"/>
           </w:rPr>
-          <w:t>Four Paths to Greatness: Inside the Coaching Philosophies of WorldTour Teams</w:t>
+          <w:t>What are the best electrolytes for sport? We test the best hydration powders and tablets for athletes</w:t>
         </w:r>
       </w:hyperlink>
     </w:p>
@@ -487,9 +399,7 @@
           <w:color w:val="444444"/>
           <w:sz w:val="19"/>
         </w:rPr>
-        <w:t xml:space="preserve">Every team is chasing greatness, but that doesn't mean they all take the same path. Four WorldTour coaches share their philosophies on preparing for one of the world's biggest bike races. </w:t>
-        <w:br/>
-        <w:t>The post Fo...</w:t>
+        <w:t>Replacing your body's electrolytes when exercising is an important factor triathletes must consider, but with so many on the market, how do you know which ones to buy? We tried and tested 10 to help y...</w:t>
       </w:r>
     </w:p>
     <w:p>
@@ -504,9 +414,9 @@
           <w:color w:val="595959"/>
           <w:sz w:val="19"/>
         </w:rPr>
-        <w:t xml:space="preserve">【Triathlete Magazine | 2026-08-06】 </w:t>
+        <w:t xml:space="preserve">【220 Triathlon | 2026-08-14】 </w:t>
       </w:r>
-      <w:hyperlink w:rId="rId21">
+      <w:hyperlink w:rId="rId19">
         <w:r>
           <w:rPr>
             <w:color w:val="1F4D78"/>
@@ -515,7 +425,7 @@
             <w:rFonts w:ascii="Calibri" w:hAnsi="Calibri" w:eastAsia="Microsoft JhengHei"/>
             <w:sz w:val="22"/>
           </w:rPr>
-          <w:t>Pro Triathletes Share Their Secrets to Racing in the Heat</w:t>
+          <w:t>Free 3-month Ironman base training plan: Build your Ironman fitness from the ground up</w:t>
         </w:r>
       </w:hyperlink>
     </w:p>
@@ -531,9 +441,7 @@
           <w:color w:val="444444"/>
           <w:sz w:val="19"/>
         </w:rPr>
-        <w:t>Racing in the heat can humble even the fittest triathletes. We asked the pros to share their secrets for acclimating, fueling, and pacing your way to a successful race day.</w:t>
-        <w:br/>
-        <w:t>Read the full article at Pr...</w:t>
+        <w:t>Got designs on conquering Ironman? Then don't neglect your base says Dermott Hayes. Here's a 3-month Ironman base training plan to prepare you for that start line</w:t>
       </w:r>
     </w:p>
     <w:p>
@@ -548,9 +456,9 @@
           <w:color w:val="595959"/>
           <w:sz w:val="19"/>
         </w:rPr>
-        <w:t xml:space="preserve">【220 Triathlon | 2026-08-06】 </w:t>
+        <w:t xml:space="preserve">【220 Triathlon | 2026-08-14】 </w:t>
       </w:r>
-      <w:hyperlink w:rId="rId22">
+      <w:hyperlink w:rId="rId20">
         <w:r>
           <w:rPr>
             <w:color w:val="1F4D78"/>
@@ -559,7 +467,7 @@
             <w:rFonts w:ascii="Calibri" w:hAnsi="Calibri" w:eastAsia="Microsoft JhengHei"/>
             <w:sz w:val="22"/>
           </w:rPr>
-          <w:t>What are the best tri-suits in 2026? We’ve tested the top racing options on the market for your next triathlon</w:t>
+          <w:t>What are the benefits (and disadvantages) of fasted training? Coach shares all you need to know</w:t>
         </w:r>
       </w:hyperlink>
     </w:p>
@@ -575,7 +483,7 @@
           <w:color w:val="444444"/>
           <w:sz w:val="19"/>
         </w:rPr>
-        <w:t>Need a new triathlon suit? Here's a comprehensive guide to 11 of the best tri-suits on the market for men and women, all independently reviewed by our experts.</w:t>
+        <w:t>Coach Joel Enoch explains all you need to know about fasted workouts, and whether they are suitable for triathlon training and racing.</w:t>
       </w:r>
     </w:p>
     <w:p>
@@ -590,9 +498,9 @@
           <w:color w:val="595959"/>
           <w:sz w:val="19"/>
         </w:rPr>
-        <w:t xml:space="preserve">【220 Triathlon | 2026-08-06】 </w:t>
+        <w:t xml:space="preserve">【220 Triathlon | 2026-08-13】 </w:t>
       </w:r>
-      <w:hyperlink w:rId="rId23">
+      <w:hyperlink w:rId="rId21">
         <w:r>
           <w:rPr>
             <w:color w:val="1F4D78"/>
@@ -601,7 +509,7 @@
             <w:rFonts w:ascii="Calibri" w:hAnsi="Calibri" w:eastAsia="Microsoft JhengHei"/>
             <w:sz w:val="22"/>
           </w:rPr>
-          <w:t>What are the best sunglasses for running? Here are our favourite 10 for clear vision and eye protection</w:t>
+          <w:t>Free 6-week Olympic triathlon training plan: Supercharge your multisport fitness on limited time</w:t>
         </w:r>
       </w:hyperlink>
     </w:p>
@@ -617,7 +525,7 @@
           <w:color w:val="444444"/>
           <w:sz w:val="19"/>
         </w:rPr>
-        <w:t>A good pair of running sunnies can make runs in bright and sunny conditions a whole lot more enjoyable, plus they save you energy. Here are our favourite 10 pairs tested by runners and why we love the...</w:t>
+        <w:t>Experienced tri coach, Dermott Hayes, shares his six-week Olympic triathlon training plan for the time-crunched athlete.</w:t>
       </w:r>
     </w:p>
     <w:p>
@@ -632,9 +540,9 @@
           <w:color w:val="595959"/>
           <w:sz w:val="19"/>
         </w:rPr>
-        <w:t xml:space="preserve">【Slowtwitch | 2026-08-06】 </w:t>
+        <w:t xml:space="preserve">【Triathlete Magazine | 2026-08-12】 </w:t>
       </w:r>
-      <w:hyperlink w:rId="rId24">
+      <w:hyperlink w:rId="rId22">
         <w:r>
           <w:rPr>
             <w:color w:val="1F4D78"/>
@@ -643,7 +551,7 @@
             <w:rFonts w:ascii="Calibri" w:hAnsi="Calibri" w:eastAsia="Microsoft JhengHei"/>
             <w:sz w:val="22"/>
           </w:rPr>
-          <w:t>The Most Common Mistakes New Cyclists Make</w:t>
+          <w:t>The Anti-Aging Magic of Hyrox for Triathletes</w:t>
         </w:r>
       </w:hyperlink>
     </w:p>
@@ -659,9 +567,9 @@
           <w:color w:val="444444"/>
           <w:sz w:val="19"/>
         </w:rPr>
-        <w:t>Some tips for biking newbies that will safe a lot of grief ... and money.</w:t>
+        <w:t>Triathletes are discovering that building muscle - not just an aerobic engine - is the secret to racing stronger for longer.</w:t>
         <w:br/>
-        <w:t>The post The Most Common Mistakes New Cyclists Make first appeared on Slowtwitch News.</w:t>
+        <w:t>Read the full article at The Anti-Aging Magic of Hyrox for Triathletes on T...</w:t>
       </w:r>
     </w:p>
     <w:p>
@@ -676,9 +584,9 @@
           <w:color w:val="595959"/>
           <w:sz w:val="19"/>
         </w:rPr>
-        <w:t xml:space="preserve">【Slowtwitch | 2026-08-05】 </w:t>
+        <w:t xml:space="preserve">【Triathlete Magazine | 2026-08-12】 </w:t>
       </w:r>
-      <w:hyperlink w:rId="rId25">
+      <w:hyperlink w:rId="rId23">
         <w:r>
           <w:rPr>
             <w:color w:val="1F4D78"/>
@@ -687,7 +595,7 @@
             <w:rFonts w:ascii="Calibri" w:hAnsi="Calibri" w:eastAsia="Microsoft JhengHei"/>
             <w:sz w:val="22"/>
           </w:rPr>
-          <w:t>Isn’t That Saddle Backwards? How Hans Aaseth Earned His Black Shirt at Norseman</w:t>
+          <w:t>I’m Tall, She’s Small – Can This $575 AI-Designed Tri Kit Really Fit Everyone?</w:t>
         </w:r>
       </w:hyperlink>
     </w:p>
@@ -703,9 +611,7 @@
           <w:color w:val="444444"/>
           <w:sz w:val="19"/>
         </w:rPr>
-        <w:t>A truly unique bike set up featuring  a 25 cm pedestal, a rear facing ISM saddle and a whole lot more.</w:t>
-        <w:br/>
-        <w:t>The post Isn’t That Saddle Backwards? How Hans Aaseth Earned His Black Shirt at Norseman first ap...</w:t>
+        <w:t>Is a $575 price tag really worth the investment for the perfect fit? We put Regna’s AI-powered tri kit to the test to see if it can finally end the chafing nightmare - and deliver a race-day suit that...</w:t>
       </w:r>
     </w:p>
     <w:p>
@@ -720,9 +626,9 @@
           <w:color w:val="595959"/>
           <w:sz w:val="19"/>
         </w:rPr>
-        <w:t xml:space="preserve">【220 Triathlon | 2026-08-05】 </w:t>
+        <w:t xml:space="preserve">【220 Triathlon | 2026-08-12】 </w:t>
       </w:r>
-      <w:hyperlink w:rId="rId26">
+      <w:hyperlink w:rId="rId24">
         <w:r>
           <w:rPr>
             <w:color w:val="1F4D78"/>
@@ -731,7 +637,7 @@
             <w:rFonts w:ascii="Calibri" w:hAnsi="Calibri" w:eastAsia="Microsoft JhengHei"/>
             <w:sz w:val="22"/>
           </w:rPr>
-          <w:t>New to triathlon? Pick from our range of free training plans for beginner triathletes</w:t>
+          <w:t>Do bigger breasts make you a faster cyclist? The science behind the Tour de France Femmes padded-bra controversy</w:t>
         </w:r>
       </w:hyperlink>
     </w:p>
@@ -747,7 +653,7 @@
           <w:color w:val="444444"/>
           <w:sz w:val="19"/>
         </w:rPr>
-        <w:t>Choose from a selection of beginner-friendly triathlon training plans to prep for racing and build fitness in the off-season.</w:t>
+        <w:t>Could changing the shape of your chest make you faster on the bike? 220 Triathlon investigates the science behind the Tour de France Femmes padded-bra controversy.</w:t>
       </w:r>
     </w:p>
     <w:p>
@@ -762,9 +668,9 @@
           <w:color w:val="595959"/>
           <w:sz w:val="19"/>
         </w:rPr>
-        <w:t xml:space="preserve">【Triathlete Magazine | 2026-08-04】 </w:t>
+        <w:t xml:space="preserve">【220 Triathlon | 2026-08-12】 </w:t>
       </w:r>
-      <w:hyperlink w:rId="rId27">
+      <w:hyperlink w:rId="rId25">
         <w:r>
           <w:rPr>
             <w:color w:val="1F4D78"/>
@@ -773,7 +679,7 @@
             <w:rFonts w:ascii="Calibri" w:hAnsi="Calibri" w:eastAsia="Microsoft JhengHei"/>
             <w:sz w:val="22"/>
           </w:rPr>
-          <w:t>Hoka Clifton Pro Review: Did Hoka Just Kill the Clifton?</w:t>
+          <w:t>Best Garmin watches for run tracking and health metrics in 2026</w:t>
         </w:r>
       </w:hyperlink>
     </w:p>
@@ -789,9 +695,7 @@
           <w:color w:val="444444"/>
           <w:sz w:val="19"/>
         </w:rPr>
-        <w:t>Hoka's best-selling trainer just got a major midsole upgrade for only $10 more, and it might make the original obsolete.</w:t>
-        <w:br/>
-        <w:t>Read the full article at Hoka Clifton Pro Review: Did Hoka Just Kill the Clifto...</w:t>
+        <w:t>Looking for a Garmin watch to track your runs and improve your training? We’ve tested the range to bring you our favourite models, from simple running watches to feature-packed multisport options.</w:t>
       </w:r>
     </w:p>
     <w:p>
@@ -806,9 +710,9 @@
           <w:color w:val="595959"/>
           <w:sz w:val="19"/>
         </w:rPr>
-        <w:t xml:space="preserve">【Slowtwitch | 2026-08-04】 </w:t>
+        <w:t xml:space="preserve">【Triathlete Magazine | 2026-08-11】 </w:t>
       </w:r>
-      <w:hyperlink w:rId="rId28">
+      <w:hyperlink w:rId="rId26">
         <w:r>
           <w:rPr>
             <w:color w:val="1F4D78"/>
@@ -817,7 +721,7 @@
             <w:rFonts w:ascii="Calibri" w:hAnsi="Calibri" w:eastAsia="Microsoft JhengHei"/>
             <w:sz w:val="22"/>
           </w:rPr>
-          <w:t>The Batch GB.1 is a $999 Gravel Bike Built to Get You Riding</w:t>
+          <w:t>High-Tech Massage or Overpriced Noise? Our Review of the $500 Therabot Robot Massager</w:t>
         </w:r>
       </w:hyperlink>
     </w:p>
@@ -833,9 +737,9 @@
           <w:color w:val="444444"/>
           <w:sz w:val="19"/>
         </w:rPr>
-        <w:t>The Batch GB.1 I comes with a MicroShift Sword 1x9 group and a lifetime frame warranty -- all under four figures.</w:t>
+        <w:t>The Therabot promises effortless, hands-free recovery, but does it deliver? We test the $500 robotic massager to see if its performance matches the sci-fi hype.</w:t>
         <w:br/>
-        <w:t>The post The Batch GB.1 is a $999 Gravel Bike Built to Get You Riding first appeared o...</w:t>
+        <w:t>Read the full article at High-Tech Mass...</w:t>
       </w:r>
     </w:p>
     <w:p>
@@ -850,9 +754,9 @@
           <w:color w:val="595959"/>
           <w:sz w:val="19"/>
         </w:rPr>
-        <w:t xml:space="preserve">【Triathlete Magazine | 2026-08-03】 </w:t>
+        <w:t xml:space="preserve">【Triathlete Magazine | 2026-08-10】 </w:t>
       </w:r>
-      <w:hyperlink w:rId="rId29">
+      <w:hyperlink w:rId="rId27">
         <w:r>
           <w:rPr>
             <w:color w:val="1F4D78"/>
@@ -861,7 +765,7 @@
             <w:rFonts w:ascii="Calibri" w:hAnsi="Calibri" w:eastAsia="Microsoft JhengHei"/>
             <w:sz w:val="22"/>
           </w:rPr>
-          <w:t>Banned by the UCI, Built for Triathletes: Inside the Wild World of Triathlon Concept Bikes</w:t>
+          <w:t>Patrick Lange on Turning 40, Retirement, and Returning to His Triathlon Roots</w:t>
         </w:r>
       </w:hyperlink>
     </w:p>
@@ -877,9 +781,7 @@
           <w:color w:val="444444"/>
           <w:sz w:val="19"/>
         </w:rPr>
-        <w:t>Concept bikes offer a look into the future of cycling. Here's why triathlon is the sport where they actually get built.</w:t>
-        <w:br/>
-        <w:t>Read the full article at Banned by the UCI, Built for Triathletes: Inside the Wi...</w:t>
+        <w:t>From his first race on an oversized bike to three titles on the Big Island, Patrick Lange discusses the "full circle" moment of announcing his retirement at the scene of his triathlon debut and what t...</w:t>
       </w:r>
     </w:p>
     <w:p>
@@ -894,9 +796,9 @@
           <w:color w:val="595959"/>
           <w:sz w:val="19"/>
         </w:rPr>
-        <w:t xml:space="preserve">【220 Triathlon | 2026-08-03】 </w:t>
+        <w:t xml:space="preserve">【220 Triathlon | 2026-08-10】 </w:t>
       </w:r>
-      <w:hyperlink w:rId="rId30">
+      <w:hyperlink w:rId="rId28">
         <w:r>
           <w:rPr>
             <w:color w:val="1F4D78"/>
@@ -905,7 +807,7 @@
             <w:rFonts w:ascii="Calibri" w:hAnsi="Calibri" w:eastAsia="Microsoft JhengHei"/>
             <w:sz w:val="22"/>
           </w:rPr>
-          <w:t>Best running earphones and headphones to soundtrack your workouts in 2026</w:t>
+          <w:t>What are the best running shorts in 2026? Our team of runners put 10 favourites to the test</w:t>
         </w:r>
       </w:hyperlink>
     </w:p>
@@ -921,7 +823,7 @@
           <w:color w:val="444444"/>
           <w:sz w:val="19"/>
         </w:rPr>
-        <w:t>Running to music is proven to offer a range of benefits to your training. Here, our experts put 9 sets of running earphones to the test</w:t>
+        <w:t>A good pair of running shorts should be comfortable, breathable, and supportive for runs of any distance. Our run team tests the best options available today...</w:t>
       </w:r>
     </w:p>
     <w:p>
@@ -951,9 +853,9 @@
           <w:color w:val="595959"/>
           <w:sz w:val="19"/>
         </w:rPr>
-        <w:t xml:space="preserve">【TrainingPeaks Blog | 2026-08-06】 </w:t>
+        <w:t xml:space="preserve">【220 Triathlon | 2026-08-16】 </w:t>
       </w:r>
-      <w:hyperlink w:rId="rId31">
+      <w:hyperlink w:rId="rId29">
         <w:r>
           <w:rPr>
             <w:color w:val="1F4D78"/>
@@ -962,7 +864,7 @@
             <w:rFonts w:ascii="Calibri" w:hAnsi="Calibri" w:eastAsia="Microsoft JhengHei"/>
             <w:sz w:val="22"/>
           </w:rPr>
-          <w:t>Breathwork for Athletes: Performance, Recovery, and Breathing Exercises</w:t>
+          <w:t>“I was flying out there. I really felt good!” Julie Derron chases down Kate Waugh to take first T100 pro season win in Vancouver</w:t>
         </w:r>
       </w:hyperlink>
     </w:p>
@@ -978,97 +880,7 @@
           <w:color w:val="444444"/>
           <w:sz w:val="19"/>
         </w:rPr>
-        <w:t>Breathwork exercises can improve health metrics, athletic performance, and recovery. Here's how to add them to your training.</w:t>
-        <w:br/>
-        <w:t>The post Breathwork for Athletes: Performance, Recovery, and Breathing Exe...</w:t>
-      </w:r>
-    </w:p>
-    <w:p>
-      <w:pPr>
-        <w:keepNext/>
-        <w:spacing w:before="160" w:after="40"/>
-      </w:pPr>
-      <w:r>
-        <w:rPr>
-          <w:rFonts w:ascii="Calibri" w:hAnsi="Calibri" w:eastAsia="Microsoft JhengHei"/>
-          <w:b/>
-          <w:color w:val="595959"/>
-          <w:sz w:val="19"/>
-        </w:rPr>
-        <w:t xml:space="preserve">【Triathlete Magazine | 2026-08-05】 </w:t>
-      </w:r>
-      <w:hyperlink w:rId="rId32">
-        <w:r>
-          <w:rPr>
-            <w:color w:val="1F4D78"/>
-            <w:u w:val="single"/>
-            <w:b/>
-            <w:rFonts w:ascii="Calibri" w:hAnsi="Calibri" w:eastAsia="Microsoft JhengHei"/>
-            <w:sz w:val="22"/>
-          </w:rPr>
-          <w:t>First Look: Topo Athletic Specter Elite</w:t>
-        </w:r>
-      </w:hyperlink>
-    </w:p>
-    <w:p>
-      <w:pPr>
-        <w:spacing w:after="200"/>
-        <w:ind w:left="360"/>
-      </w:pPr>
-      <w:r>
-        <w:rPr>
-          <w:rFonts w:ascii="Calibri" w:hAnsi="Calibri" w:eastAsia="Microsoft JhengHei"/>
-          <w:b w:val="0"/>
-          <w:color w:val="444444"/>
-          <w:sz w:val="19"/>
-        </w:rPr>
-        <w:t>This debut carbon-plated racing shoe goes straight to the front of the pack</w:t>
-        <w:br/>
-        <w:t>Read the full article at First Look: Topo Athletic Specter Elite on Triathlete.</w:t>
-      </w:r>
-    </w:p>
-    <w:p>
-      <w:pPr>
-        <w:keepNext/>
-        <w:spacing w:before="160" w:after="40"/>
-      </w:pPr>
-      <w:r>
-        <w:rPr>
-          <w:rFonts w:ascii="Calibri" w:hAnsi="Calibri" w:eastAsia="Microsoft JhengHei"/>
-          <w:b/>
-          <w:color w:val="595959"/>
-          <w:sz w:val="19"/>
-        </w:rPr>
-        <w:t xml:space="preserve">【TrainingPeaks Blog | 2026-08-05】 </w:t>
-      </w:r>
-      <w:hyperlink w:rId="rId33">
-        <w:r>
-          <w:rPr>
-            <w:color w:val="1F4D78"/>
-            <w:u w:val="single"/>
-            <w:b/>
-            <w:rFonts w:ascii="Calibri" w:hAnsi="Calibri" w:eastAsia="Microsoft JhengHei"/>
-            <w:sz w:val="22"/>
-          </w:rPr>
-          <w:t>How Poor Air Quality Affects Performance &amp; What Athletes Can Do About It</w:t>
-        </w:r>
-      </w:hyperlink>
-    </w:p>
-    <w:p>
-      <w:pPr>
-        <w:spacing w:after="200"/>
-        <w:ind w:left="360"/>
-      </w:pPr>
-      <w:r>
-        <w:rPr>
-          <w:rFonts w:ascii="Calibri" w:hAnsi="Calibri" w:eastAsia="Microsoft JhengHei"/>
-          <w:b w:val="0"/>
-          <w:color w:val="444444"/>
-          <w:sz w:val="19"/>
-        </w:rPr>
-        <w:t>Air pollution carries short- and long-term risks for athletes. Using AirTrack while planning your TrainingPeaks sessions can help reduce your air pollution exposure.</w:t>
-        <w:br/>
-        <w:t>The post How Poor Air Quality Affe...</w:t>
+        <w:t>Swiss star Julia Derron (SUI) chased down the returning British T100 World Champion Kate Waugh (GBR) on the run to record her first T100 victory of the season in Vancouver. Georgia Taylor-Brown took t...</w:t>
       </w:r>
     </w:p>
     <w:p>
@@ -1098,9 +910,9 @@
           <w:color w:val="595959"/>
           <w:sz w:val="19"/>
         </w:rPr>
-        <w:t xml:space="preserve">【Slowtwitch | 2026-08-10】 </w:t>
+        <w:t xml:space="preserve">【220 Triathlon | 2026-08-16】 </w:t>
       </w:r>
-      <w:hyperlink w:rId="rId34">
+      <w:hyperlink w:rId="rId30">
         <w:r>
           <w:rPr>
             <w:color w:val="1F4D78"/>
@@ -1109,7 +921,7 @@
             <w:rFonts w:ascii="Calibri" w:hAnsi="Calibri" w:eastAsia="Microsoft JhengHei"/>
             <w:sz w:val="22"/>
           </w:rPr>
-          <w:t>Ritchey SuperLogic Butano Ridge: A Pricey Offering</w:t>
+          <w:t>“It was pretty, pretty windy out there today!” Laura Philipp dominates Ironman Kalmar to win by 18 minutes</w:t>
         </w:r>
       </w:hyperlink>
     </w:p>
@@ -1125,9 +937,7 @@
           <w:color w:val="444444"/>
           <w:sz w:val="19"/>
         </w:rPr>
-        <w:t>I have always seen Ritchey as a small shop business that produces good products that are within the expected budget for that particular product category. As in, here is X...</w:t>
-        <w:br/>
-        <w:t>The post Ritchey SuperLogi...</w:t>
+        <w:t>Germany’s Laura Philipp showed tenacity at Ironman Kalmar, in a performance that revealed her strength ahead of the Ironman World Champs in a couple of months. Ironman Kalmar offers an important momen...</w:t>
       </w:r>
     </w:p>
     <w:p>
@@ -1142,9 +952,9 @@
           <w:color w:val="595959"/>
           <w:sz w:val="19"/>
         </w:rPr>
-        <w:t xml:space="preserve">【220 Triathlon | 2026-08-09】 </w:t>
+        <w:t xml:space="preserve">【Slowtwitch | 2026-08-16】 </w:t>
       </w:r>
-      <w:hyperlink w:rId="rId35">
+      <w:hyperlink w:rId="rId31">
         <w:r>
           <w:rPr>
             <w:color w:val="1F4D78"/>
@@ -1153,7 +963,7 @@
             <w:rFonts w:ascii="Calibri" w:hAnsi="Calibri" w:eastAsia="Microsoft JhengHei"/>
             <w:sz w:val="22"/>
           </w:rPr>
-          <w:t>What should you be eating for breakfast as an athlete? Nutritionist shares best energy-packed meals</w:t>
+          <w:t>Julie Derron Wins T100 Vancouver 2026 — Race Recap in Photos</w:t>
         </w:r>
       </w:hyperlink>
     </w:p>
@@ -1169,7 +979,9 @@
           <w:color w:val="444444"/>
           <w:sz w:val="19"/>
         </w:rPr>
-        <w:t>Try out these easy, four recipes to boost energy levels for an early-morning workout or replenish depleted energy stores post-session…</w:t>
+        <w:t>An exciting day of racing recapped in photos.</w:t>
+        <w:br/>
+        <w:t>The post Julie Derron Wins T100 Vancouver 2026 — Race Recap in Photos first appeared on Slowtwitch News.</w:t>
       </w:r>
     </w:p>
     <w:p>
@@ -1184,9 +996,9 @@
           <w:color w:val="595959"/>
           <w:sz w:val="19"/>
         </w:rPr>
-        <w:t xml:space="preserve">【Slowtwitch | 2026-08-08】 </w:t>
+        <w:t xml:space="preserve">【Triathlete Magazine | 2026-08-16】 </w:t>
       </w:r>
-      <w:hyperlink w:rId="rId36">
+      <w:hyperlink w:rId="rId32">
         <w:r>
           <w:rPr>
             <w:color w:val="1F4D78"/>
@@ -1195,7 +1007,7 @@
             <w:rFonts w:ascii="Calibri" w:hAnsi="Calibri" w:eastAsia="Microsoft JhengHei"/>
             <w:sz w:val="22"/>
           </w:rPr>
-          <w:t>We Noticed: Alpe d’Huez Triathlon, Kristian and Gustav’s New Ride and More</w:t>
+          <w:t>Lightning-Fast Ironman Kalmar Wins for Laura Philipp and Jonas Schomburg Preview Exceptional Kona Form</w:t>
         </w:r>
       </w:hyperlink>
     </w:p>
@@ -1211,9 +1023,7 @@
           <w:color w:val="444444"/>
           <w:sz w:val="19"/>
         </w:rPr>
-        <w:t>Siffert takes third title, Mossel Bay to host IRONMAN South Africa, Roka Multisport draw and other news.</w:t>
-        <w:br/>
-        <w:t>The post We Noticed: Alpe d’Huez Triathlon, Kristian and Gustav’s New Ride and More first appea...</w:t>
+        <w:t>In a record-breaking, spectator-filled race, Laura Philipp and Jonas Schomburg put on a show to remember, producing two of the fastest Ironman performances in history and showcasing world championship...</w:t>
       </w:r>
     </w:p>
     <w:p>
@@ -1228,9 +1038,9 @@
           <w:color w:val="595959"/>
           <w:sz w:val="19"/>
         </w:rPr>
-        <w:t xml:space="preserve">【220 Triathlon | 2026-08-07】 </w:t>
+        <w:t xml:space="preserve">【Slowtwitch | 2026-08-15】 </w:t>
       </w:r>
-      <w:hyperlink w:rId="rId37">
+      <w:hyperlink w:rId="rId33">
         <w:r>
           <w:rPr>
             <w:color w:val="1F4D78"/>
@@ -1239,7 +1049,7 @@
             <w:rFonts w:ascii="Calibri" w:hAnsi="Calibri" w:eastAsia="Microsoft JhengHei"/>
             <w:sz w:val="22"/>
           </w:rPr>
-          <w:t>Build an athletes body from the bones up with these nutritionist-approved recipes</w:t>
+          <w:t>IRONMAN Kalmar 2026: Schomburg’s First Title, Philipp Breaks Course Record</w:t>
         </w:r>
       </w:hyperlink>
     </w:p>
@@ -1255,9 +1065,9 @@
           <w:color w:val="444444"/>
           <w:sz w:val="19"/>
         </w:rPr>
-        <w:t>Whatever your age it’s never too late to focus on bone health. But how</w:t>
+        <w:t>It was a day of German domination in Sweden.</w:t>
         <w:br/>
-        <w:t>can your diet help? Simple, you need vitamin D, calcium and magnesium. Kate Percy has these recipes to try</w:t>
+        <w:t>The post IRONMAN Kalmar 2026: Schomburg’s First Title, Philipp Breaks Course Record first appeared on Slowtwitch News.</w:t>
       </w:r>
     </w:p>
     <w:p>
@@ -1272,9 +1082,9 @@
           <w:color w:val="595959"/>
           <w:sz w:val="19"/>
         </w:rPr>
-        <w:t xml:space="preserve">【220 Triathlon | 2026-08-06】 </w:t>
+        <w:t xml:space="preserve">【220 Triathlon | 2026-08-15】 </w:t>
       </w:r>
-      <w:hyperlink w:rId="rId38">
+      <w:hyperlink w:rId="rId34">
         <w:r>
           <w:rPr>
             <w:color w:val="1F4D78"/>
@@ -1283,7 +1093,7 @@
             <w:rFonts w:ascii="Calibri" w:hAnsi="Calibri" w:eastAsia="Microsoft JhengHei"/>
             <w:sz w:val="22"/>
           </w:rPr>
-          <w:t>Start training for an Ironman in 2027 with these free Ironman training plans from 3 to 12 months</w:t>
+          <w:t>Free strength training plan for triathletes: Build strength alongside six-time Ironman world champion</w:t>
         </w:r>
       </w:hyperlink>
     </w:p>
@@ -1299,7 +1109,7 @@
           <w:color w:val="444444"/>
           <w:sz w:val="19"/>
         </w:rPr>
-        <w:t>Designed by a triathlon coach, these free training plans will see you through the base, build and peak phases of your Ironman training.</w:t>
+        <w:t>Six-time Ironman World Champion Dave Scott recommends these SC exercises you can do at home with minimal equipment.</w:t>
       </w:r>
     </w:p>
     <w:p>
@@ -1314,9 +1124,9 @@
           <w:color w:val="595959"/>
           <w:sz w:val="19"/>
         </w:rPr>
-        <w:t xml:space="preserve">【Triathlete Magazine | 2026-08-05】 </w:t>
+        <w:t xml:space="preserve">【Slowtwitch | 2026-08-15】 </w:t>
       </w:r>
-      <w:hyperlink w:rId="rId39">
+      <w:hyperlink w:rId="rId35">
         <w:r>
           <w:rPr>
             <w:color w:val="1F4D78"/>
@@ -1325,7 +1135,7 @@
             <w:rFonts w:ascii="Calibri" w:hAnsi="Calibri" w:eastAsia="Microsoft JhengHei"/>
             <w:sz w:val="22"/>
           </w:rPr>
-          <w:t>The Hottest Triathlon World Championship Races in History</w:t>
+          <w:t>Parkinson’s Isn’t Going to Win: One More for David Walker at T100 Vancouver</w:t>
         </w:r>
       </w:hyperlink>
     </w:p>
@@ -1341,9 +1151,9 @@
           <w:color w:val="444444"/>
           <w:sz w:val="19"/>
         </w:rPr>
-        <w:t>From Kona's lava fields to Paris's midday sun, we revisit the most brutal, sweat-soaked races in triathlon history where the climate was the toughest competitor.</w:t>
+        <w:t>Determined that Parkinson's won't tell him when he's done, this 76-year-old is back for one last triathlon</w:t>
         <w:br/>
-        <w:t>Read the full article at The Hottest T...</w:t>
+        <w:t>The post Parkinson’s Isn’t Going to Win: One More for David Walker at T100 Vancouver first ap...</w:t>
       </w:r>
     </w:p>
     <w:p>
@@ -1358,9 +1168,9 @@
           <w:color w:val="595959"/>
           <w:sz w:val="19"/>
         </w:rPr>
-        <w:t xml:space="preserve">【Triathlete Magazine | 2026-08-05】 </w:t>
+        <w:t xml:space="preserve">【Slowtwitch | 2026-08-15】 </w:t>
       </w:r>
-      <w:hyperlink w:rId="rId40">
+      <w:hyperlink w:rId="rId36">
         <w:r>
           <w:rPr>
             <w:color w:val="1F4D78"/>
@@ -1369,7 +1179,7 @@
             <w:rFonts w:ascii="Calibri" w:hAnsi="Calibri" w:eastAsia="Microsoft JhengHei"/>
             <w:sz w:val="22"/>
           </w:rPr>
-          <w:t>How Tilly Offord Survived a Near-Fatal Crash and Found Her Way Back to Triathlon</w:t>
+          <w:t>The 2026 Leadville 100 MTB Cometh</w:t>
         </w:r>
       </w:hyperlink>
     </w:p>
@@ -1385,7 +1195,9 @@
           <w:color w:val="444444"/>
           <w:sz w:val="19"/>
         </w:rPr>
-        <w:t>Tilly Offord was a rising star in elite triathlon until a collision with a truck changed everything. Now, more than three years after the near-fatal day, she’s returned to racing and the relentless pu...</w:t>
+        <w:t>The Race Across the Sky returns for its 32nd edition this weekend.</w:t>
+        <w:br/>
+        <w:t>The post The 2026 Leadville 100 MTB Cometh first appeared on Slowtwitch News.</w:t>
       </w:r>
     </w:p>
     <w:p>
@@ -1400,9 +1212,9 @@
           <w:color w:val="595959"/>
           <w:sz w:val="19"/>
         </w:rPr>
-        <w:t xml:space="preserve">【220 Triathlon | 2026-08-05】 </w:t>
+        <w:t xml:space="preserve">【Slowtwitch | 2026-08-15】 </w:t>
       </w:r>
-      <w:hyperlink w:rId="rId41">
+      <w:hyperlink w:rId="rId37">
         <w:r>
           <w:rPr>
             <w:color w:val="1F4D78"/>
@@ -1411,7 +1223,7 @@
             <w:rFonts w:ascii="Calibri" w:hAnsi="Calibri" w:eastAsia="Microsoft JhengHei"/>
             <w:sz w:val="22"/>
           </w:rPr>
-          <w:t>Choose from our free Olympic-distance triathlon training plans and smash your next race</w:t>
+          <w:t>Three Roads to the Start Line: Paula Findlay, Georgia Taylor-Brown and Kate Waugh on Racing T100 Vancouver</w:t>
         </w:r>
       </w:hyperlink>
     </w:p>
@@ -1427,7 +1239,9 @@
           <w:color w:val="444444"/>
           <w:sz w:val="19"/>
         </w:rPr>
-        <w:t>Got an Olympic distance triathlon in the diary? Pick from one of our free training plans to get race-ready in no time.</w:t>
+        <w:t>Three athletes, three timelines, one Saturday in Vancouver where it all gets tested at once.</w:t>
+        <w:br/>
+        <w:t>The post Three Roads to the Start Line: Paula Findlay, Georgia Taylor-Brown and Kate Waugh on Racing T100 V...</w:t>
       </w:r>
     </w:p>
     <w:p>
@@ -1442,9 +1256,9 @@
           <w:color w:val="595959"/>
           <w:sz w:val="19"/>
         </w:rPr>
-        <w:t xml:space="preserve">【Slowtwitch | 2026-08-04】 </w:t>
+        <w:t xml:space="preserve">【220 Triathlon | 2026-08-14】 </w:t>
       </w:r>
-      <w:hyperlink w:rId="rId42">
+      <w:hyperlink w:rId="rId38">
         <w:r>
           <w:rPr>
             <w:color w:val="1F4D78"/>
@@ -1453,7 +1267,7 @@
             <w:rFonts w:ascii="Calibri" w:hAnsi="Calibri" w:eastAsia="Microsoft JhengHei"/>
             <w:sz w:val="22"/>
           </w:rPr>
-          <w:t>Ladies Day at the Norseman: 4 Inspirational Stories</w:t>
+          <w:t>What are the best Olympic triathlons in the UK? We rate our top 10 races to get your teeth into next season</w:t>
         </w:r>
       </w:hyperlink>
     </w:p>
@@ -1469,9 +1283,7 @@
           <w:color w:val="444444"/>
           <w:sz w:val="19"/>
         </w:rPr>
-        <w:t>We caught up with four incredible women who completed the Norseman in style.</w:t>
-        <w:br/>
-        <w:t>The post Ladies Day at the Norseman: 4 Inspirational Stories first appeared on Slowtwitch News.</w:t>
+        <w:t>Looking for a Standard distance triathlon to dip your feet into the world of tri? We've picked 10 of the best Olympic triathlons in the UK, plus some last-season European wildcards.</w:t>
       </w:r>
     </w:p>
     <w:p>
@@ -1486,9 +1298,9 @@
           <w:color w:val="595959"/>
           <w:sz w:val="19"/>
         </w:rPr>
-        <w:t xml:space="preserve">【220 Triathlon | 2026-08-03】 </w:t>
+        <w:t xml:space="preserve">【Triathlete Magazine | 2026-08-14】 </w:t>
       </w:r>
-      <w:hyperlink w:rId="rId43">
+      <w:hyperlink w:rId="rId39">
         <w:r>
           <w:rPr>
             <w:color w:val="1F4D78"/>
@@ -1497,7 +1309,7 @@
             <w:rFonts w:ascii="Calibri" w:hAnsi="Calibri" w:eastAsia="Microsoft JhengHei"/>
             <w:sz w:val="22"/>
           </w:rPr>
-          <w:t>How to watch the T100 Vancouver Women’s Pro race</w:t>
+          <w:t>The Triathlete’s Guide to Safely (and Effectively) Training in Hot Weather</w:t>
         </w:r>
       </w:hyperlink>
     </w:p>
@@ -1513,7 +1325,397 @@
           <w:color w:val="444444"/>
           <w:sz w:val="19"/>
         </w:rPr>
-        <w:t>The 2026 T100 Triathlon World Tour heads to Vancouver for the third women's race of the season. Here's everything you need to know, including the start list, course, start time and how to watch live.</w:t>
+        <w:t>Don't let the heat of the dog days spoil your training. Use these tips to train safely and effectively through the summer months.</w:t>
+        <w:br/>
+        <w:t>Read the full article at The Triathlete’s Guide to Safely (and Effecti...</w:t>
+      </w:r>
+    </w:p>
+    <w:p>
+      <w:pPr>
+        <w:keepNext/>
+        <w:spacing w:before="160" w:after="40"/>
+      </w:pPr>
+      <w:r>
+        <w:rPr>
+          <w:rFonts w:ascii="Calibri" w:hAnsi="Calibri" w:eastAsia="Microsoft JhengHei"/>
+          <w:b/>
+          <w:color w:val="595959"/>
+          <w:sz w:val="19"/>
+        </w:rPr>
+        <w:t xml:space="preserve">【Slowtwitch | 2026-08-14】 </w:t>
+      </w:r>
+      <w:hyperlink w:rId="rId40">
+        <w:r>
+          <w:rPr>
+            <w:color w:val="1F4D78"/>
+            <w:u w:val="single"/>
+            <w:b/>
+            <w:rFonts w:ascii="Calibri" w:hAnsi="Calibri" w:eastAsia="Microsoft JhengHei"/>
+            <w:sz w:val="22"/>
+          </w:rPr>
+          <w:t>Who and How to Watch T100 Vancouver This Weekend</w:t>
+        </w:r>
+      </w:hyperlink>
+    </w:p>
+    <w:p>
+      <w:pPr>
+        <w:spacing w:after="200"/>
+        <w:ind w:left="360"/>
+      </w:pPr>
+      <w:r>
+        <w:rPr>
+          <w:rFonts w:ascii="Calibri" w:hAnsi="Calibri" w:eastAsia="Microsoft JhengHei"/>
+          <w:b w:val="0"/>
+          <w:color w:val="444444"/>
+          <w:sz w:val="19"/>
+        </w:rPr>
+        <w:t>We preview what should be an interesting pro race at T100 Vancouver this weekend.</w:t>
+        <w:br/>
+        <w:t>The post Who and How to Watch T100 Vancouver This Weekend first appeared on Slowtwitch News.</w:t>
+      </w:r>
+    </w:p>
+    <w:p>
+      <w:pPr>
+        <w:keepNext/>
+        <w:spacing w:before="160" w:after="40"/>
+      </w:pPr>
+      <w:r>
+        <w:rPr>
+          <w:rFonts w:ascii="Calibri" w:hAnsi="Calibri" w:eastAsia="Microsoft JhengHei"/>
+          <w:b/>
+          <w:color w:val="595959"/>
+          <w:sz w:val="19"/>
+        </w:rPr>
+        <w:t xml:space="preserve">【Slowtwitch | 2026-08-13】 </w:t>
+      </w:r>
+      <w:hyperlink w:rId="rId41">
+        <w:r>
+          <w:rPr>
+            <w:color w:val="1F4D78"/>
+            <w:u w:val="single"/>
+            <w:b/>
+            <w:rFonts w:ascii="Calibri" w:hAnsi="Calibri" w:eastAsia="Microsoft JhengHei"/>
+            <w:sz w:val="22"/>
+          </w:rPr>
+          <w:t>Why Gravel Is the Perfect Second Sport for Triathletes</w:t>
+        </w:r>
+      </w:hyperlink>
+    </w:p>
+    <w:p>
+      <w:pPr>
+        <w:spacing w:after="200"/>
+        <w:ind w:left="360"/>
+      </w:pPr>
+      <w:r>
+        <w:rPr>
+          <w:rFonts w:ascii="Calibri" w:hAnsi="Calibri" w:eastAsia="Microsoft JhengHei"/>
+          <w:b w:val="0"/>
+          <w:color w:val="444444"/>
+          <w:sz w:val="19"/>
+        </w:rPr>
+        <w:t>A match made in heaven...</w:t>
+        <w:br/>
+        <w:t>The post Why Gravel Is the Perfect Second Sport for Triathletes first appeared on Slowtwitch News.</w:t>
+      </w:r>
+    </w:p>
+    <w:p>
+      <w:pPr>
+        <w:keepNext/>
+        <w:spacing w:before="160" w:after="40"/>
+      </w:pPr>
+      <w:r>
+        <w:rPr>
+          <w:rFonts w:ascii="Calibri" w:hAnsi="Calibri" w:eastAsia="Microsoft JhengHei"/>
+          <w:b/>
+          <w:color w:val="595959"/>
+          <w:sz w:val="19"/>
+        </w:rPr>
+        <w:t xml:space="preserve">【220 Triathlon | 2026-08-13】 </w:t>
+      </w:r>
+      <w:hyperlink w:rId="rId42">
+        <w:r>
+          <w:rPr>
+            <w:color w:val="1F4D78"/>
+            <w:u w:val="single"/>
+            <w:b/>
+            <w:rFonts w:ascii="Calibri" w:hAnsi="Calibri" w:eastAsia="Microsoft JhengHei"/>
+            <w:sz w:val="22"/>
+          </w:rPr>
+          <w:t>Free 8-week winter strength training plan: Supercharge your strength and power for triathlon</w:t>
+        </w:r>
+      </w:hyperlink>
+    </w:p>
+    <w:p>
+      <w:pPr>
+        <w:spacing w:after="200"/>
+        <w:ind w:left="360"/>
+      </w:pPr>
+      <w:r>
+        <w:rPr>
+          <w:rFonts w:ascii="Calibri" w:hAnsi="Calibri" w:eastAsia="Microsoft JhengHei"/>
+          <w:b w:val="0"/>
+          <w:color w:val="444444"/>
+          <w:sz w:val="19"/>
+        </w:rPr>
+        <w:t>This winter, build your base with this free eight-week strength training plan from Dermot Hayes, and be ready to launch into your new and bestest racing season.</w:t>
+      </w:r>
+    </w:p>
+    <w:p>
+      <w:pPr>
+        <w:keepNext/>
+        <w:spacing w:before="160" w:after="40"/>
+      </w:pPr>
+      <w:r>
+        <w:rPr>
+          <w:rFonts w:ascii="Calibri" w:hAnsi="Calibri" w:eastAsia="Microsoft JhengHei"/>
+          <w:b/>
+          <w:color w:val="595959"/>
+          <w:sz w:val="19"/>
+        </w:rPr>
+        <w:t xml:space="preserve">【Triathlete Magazine | 2026-08-13】 </w:t>
+      </w:r>
+      <w:hyperlink w:rId="rId43">
+        <w:r>
+          <w:rPr>
+            <w:color w:val="1F4D78"/>
+            <w:u w:val="single"/>
+            <w:b/>
+            <w:rFonts w:ascii="Calibri" w:hAnsi="Calibri" w:eastAsia="Microsoft JhengHei"/>
+            <w:sz w:val="22"/>
+          </w:rPr>
+          <w:t>Is Liquid-Only Fueling the Secret to Your Next Triathlon PR?</w:t>
+        </w:r>
+      </w:hyperlink>
+    </w:p>
+    <w:p>
+      <w:pPr>
+        <w:spacing w:after="200"/>
+        <w:ind w:left="360"/>
+      </w:pPr>
+      <w:r>
+        <w:rPr>
+          <w:rFonts w:ascii="Calibri" w:hAnsi="Calibri" w:eastAsia="Microsoft JhengHei"/>
+          <w:b w:val="0"/>
+          <w:color w:val="444444"/>
+          <w:sz w:val="19"/>
+        </w:rPr>
+        <w:t>Some triathletes are streamlining their race-day nutrition by ditching the gels and chews. Sports dietitian Matt Kadey explains how to master the liquid-only approach for better gut health and peak pe...</w:t>
+      </w:r>
+    </w:p>
+    <w:p>
+      <w:pPr>
+        <w:keepNext/>
+        <w:spacing w:before="160" w:after="40"/>
+      </w:pPr>
+      <w:r>
+        <w:rPr>
+          <w:rFonts w:ascii="Calibri" w:hAnsi="Calibri" w:eastAsia="Microsoft JhengHei"/>
+          <w:b/>
+          <w:color w:val="595959"/>
+          <w:sz w:val="19"/>
+        </w:rPr>
+        <w:t xml:space="preserve">【Slowtwitch | 2026-08-13】 </w:t>
+      </w:r>
+      <w:hyperlink w:rId="rId44">
+        <w:r>
+          <w:rPr>
+            <w:color w:val="1F4D78"/>
+            <w:u w:val="single"/>
+            <w:b/>
+            <w:rFonts w:ascii="Calibri" w:hAnsi="Calibri" w:eastAsia="Microsoft JhengHei"/>
+            <w:sz w:val="22"/>
+          </w:rPr>
+          <w:t>Forget the 1% Gains: Go After 10% Breakthroughs</w:t>
+        </w:r>
+      </w:hyperlink>
+    </w:p>
+    <w:p>
+      <w:pPr>
+        <w:spacing w:after="200"/>
+        <w:ind w:left="360"/>
+      </w:pPr>
+      <w:r>
+        <w:rPr>
+          <w:rFonts w:ascii="Calibri" w:hAnsi="Calibri" w:eastAsia="Microsoft JhengHei"/>
+          <w:b w:val="0"/>
+          <w:color w:val="444444"/>
+          <w:sz w:val="19"/>
+        </w:rPr>
+        <w:t>These training, tech and recovery hacks could be the key to your next breakthrough.</w:t>
+        <w:br/>
+        <w:t>The post Forget the 1% Gains: Go After 10% Breakthroughs first appeared on Slowtwitch News.</w:t>
+      </w:r>
+    </w:p>
+    <w:p>
+      <w:pPr>
+        <w:keepNext/>
+        <w:spacing w:before="160" w:after="40"/>
+      </w:pPr>
+      <w:r>
+        <w:rPr>
+          <w:rFonts w:ascii="Calibri" w:hAnsi="Calibri" w:eastAsia="Microsoft JhengHei"/>
+          <w:b/>
+          <w:color w:val="595959"/>
+          <w:sz w:val="19"/>
+        </w:rPr>
+        <w:t xml:space="preserve">【Slowtwitch | 2026-08-12】 </w:t>
+      </w:r>
+      <w:hyperlink w:rId="rId45">
+        <w:r>
+          <w:rPr>
+            <w:color w:val="1F4D78"/>
+            <w:u w:val="single"/>
+            <w:b/>
+            <w:rFonts w:ascii="Calibri" w:hAnsi="Calibri" w:eastAsia="Microsoft JhengHei"/>
+            <w:sz w:val="22"/>
+          </w:rPr>
+          <w:t>Retail Pricing Practices in U.S. Might be Forced to Change Due to California Lawsuits</w:t>
+        </w:r>
+      </w:hyperlink>
+    </w:p>
+    <w:p>
+      <w:pPr>
+        <w:spacing w:after="200"/>
+        <w:ind w:left="360"/>
+      </w:pPr>
+      <w:r>
+        <w:rPr>
+          <w:rFonts w:ascii="Calibri" w:hAnsi="Calibri" w:eastAsia="Microsoft JhengHei"/>
+          <w:b w:val="0"/>
+          <w:color w:val="444444"/>
+          <w:sz w:val="19"/>
+        </w:rPr>
+        <w:t>Retail pricing practices are undergoing new scrutiny following the filing of two lawsuits last month that allege deceptive pricing practices by two big brand names.</w:t>
+        <w:br/>
+        <w:t>The post Retail Pricing Practices i...</w:t>
+      </w:r>
+    </w:p>
+    <w:p>
+      <w:pPr>
+        <w:keepNext/>
+        <w:spacing w:before="160" w:after="40"/>
+      </w:pPr>
+      <w:r>
+        <w:rPr>
+          <w:rFonts w:ascii="Calibri" w:hAnsi="Calibri" w:eastAsia="Microsoft JhengHei"/>
+          <w:b/>
+          <w:color w:val="595959"/>
+          <w:sz w:val="19"/>
+        </w:rPr>
+        <w:t xml:space="preserve">【Slowtwitch | 2026-08-12】 </w:t>
+      </w:r>
+      <w:hyperlink w:rId="rId46">
+        <w:r>
+          <w:rPr>
+            <w:color w:val="1F4D78"/>
+            <w:u w:val="single"/>
+            <w:b/>
+            <w:rFonts w:ascii="Calibri" w:hAnsi="Calibri" w:eastAsia="Microsoft JhengHei"/>
+            <w:sz w:val="22"/>
+          </w:rPr>
+          <w:t>Are Kettlebells a Hack for Triathlon Strength Training?</w:t>
+        </w:r>
+      </w:hyperlink>
+    </w:p>
+    <w:p>
+      <w:pPr>
+        <w:spacing w:after="200"/>
+        <w:ind w:left="360"/>
+      </w:pPr>
+      <w:r>
+        <w:rPr>
+          <w:rFonts w:ascii="Calibri" w:hAnsi="Calibri" w:eastAsia="Microsoft JhengHei"/>
+          <w:b w:val="0"/>
+          <w:color w:val="444444"/>
+          <w:sz w:val="19"/>
+        </w:rPr>
+        <w:t>If you can't afford a full home gym setup, one or two kettlebells could do the trick.</w:t>
+        <w:br/>
+        <w:t>The post Are Kettlebells a Hack for Triathlon Strength Training? first appeared on Slowtwitch News.</w:t>
+      </w:r>
+    </w:p>
+    <w:p>
+      <w:pPr>
+        <w:keepNext/>
+        <w:spacing w:before="160" w:after="40"/>
+      </w:pPr>
+      <w:r>
+        <w:rPr>
+          <w:rFonts w:ascii="Calibri" w:hAnsi="Calibri" w:eastAsia="Microsoft JhengHei"/>
+          <w:b/>
+          <w:color w:val="595959"/>
+          <w:sz w:val="19"/>
+        </w:rPr>
+        <w:t xml:space="preserve">【Triathlete Magazine | 2026-08-11】 </w:t>
+      </w:r>
+      <w:hyperlink w:rId="rId47">
+        <w:r>
+          <w:rPr>
+            <w:color w:val="1F4D78"/>
+            <w:u w:val="single"/>
+            <w:b/>
+            <w:rFonts w:ascii="Calibri" w:hAnsi="Calibri" w:eastAsia="Microsoft JhengHei"/>
+            <w:sz w:val="22"/>
+          </w:rPr>
+          <w:t>2026 Ironman 70.3 World Championship: Pro Start Lists and How to Watch</w:t>
+        </w:r>
+      </w:hyperlink>
+    </w:p>
+    <w:p>
+      <w:pPr>
+        <w:spacing w:after="200"/>
+        <w:ind w:left="360"/>
+      </w:pPr>
+      <w:r>
+        <w:rPr>
+          <w:rFonts w:ascii="Calibri" w:hAnsi="Calibri" w:eastAsia="Microsoft JhengHei"/>
+          <w:b w:val="0"/>
+          <w:color w:val="444444"/>
+          <w:sz w:val="19"/>
+        </w:rPr>
+        <w:t>This year's 70.3 worlds will feature an all-star lineup, including Lucy Charles-Barclay, Taylor Knibb, Kristian Blummenfelt, and more. See the full start list and race numbers for the women's and men'...</w:t>
+      </w:r>
+    </w:p>
+    <w:p>
+      <w:pPr>
+        <w:keepNext/>
+        <w:spacing w:before="160" w:after="40"/>
+      </w:pPr>
+      <w:r>
+        <w:rPr>
+          <w:rFonts w:ascii="Calibri" w:hAnsi="Calibri" w:eastAsia="Microsoft JhengHei"/>
+          <w:b/>
+          <w:color w:val="595959"/>
+          <w:sz w:val="19"/>
+        </w:rPr>
+        <w:t xml:space="preserve">【220 Triathlon | 2026-08-10】 </w:t>
+      </w:r>
+      <w:hyperlink w:rId="rId48">
+        <w:r>
+          <w:rPr>
+            <w:color w:val="1F4D78"/>
+            <w:u w:val="single"/>
+            <w:b/>
+            <w:rFonts w:ascii="Calibri" w:hAnsi="Calibri" w:eastAsia="Microsoft JhengHei"/>
+            <w:sz w:val="22"/>
+          </w:rPr>
+          <w:t>Is triathlon a ‘one and done’ sport? 220 Triathlon readers have their say</w:t>
+        </w:r>
+      </w:hyperlink>
+    </w:p>
+    <w:p>
+      <w:pPr>
+        <w:spacing w:after="200"/>
+        <w:ind w:left="360"/>
+      </w:pPr>
+      <w:r>
+        <w:rPr>
+          <w:rFonts w:ascii="Calibri" w:hAnsi="Calibri" w:eastAsia="Microsoft JhengHei"/>
+          <w:b w:val="0"/>
+          <w:color w:val="444444"/>
+          <w:sz w:val="19"/>
+        </w:rPr>
+        <w:t>Is there a ‘one and done’ culture in triathlon, and if so, does it matter? This was the focus of a recent 220 feature that lit a touchpaper for readers to provide hundreds of responses, drawing on the...</w:t>
       </w:r>
     </w:p>
     <w:sectPr>
@@ -1542,7 +1744,7 @@
         <w:color w:val="777777"/>
         <w:sz w:val="18"/>
       </w:rPr>
-      <w:t>W33 鐵人新知整理報告 | 彙整日期：2026-08-10</w:t>
+      <w:t>W33 鐵人新知整理報告 | 彙整日期：2026-08-16</w:t>
     </w:r>
   </w:p>
 </w:ftr>

</xml_diff>